<commit_message>
add system architecture diagram
</commit_message>
<xml_diff>
--- a/(CSE5952adw)MIDTERM PROJECT.docx
+++ b/(CSE5952adw)MIDTERM PROJECT.docx
@@ -58,6 +58,19 @@
           <w14:ligatures w14:val="none"/>
         </w:rPr>
         <w:t>Тема: Комплексная разработка технической документации дипломного проекта</w:t>
+      </w:r>
+      <w:r>
+        <w:rPr>
+          <w:rFonts w:ascii="Times New Roman" w:eastAsia="Times New Roman" w:hAnsi="Times New Roman" w:cs="Times New Roman"/>
+          <w:b/>
+          <w:bCs/>
+          <w:kern w:val="0"/>
+          <w:sz w:val="28"/>
+          <w:szCs w:val="28"/>
+          <w:lang w:val="ru-RU" w:eastAsia="ru-RU"/>
+          <w14:ligatures w14:val="none"/>
+        </w:rPr>
+        <w:t>.</w:t>
       </w:r>
       <w:r>
         <w:rPr>

</xml_diff>

<commit_message>
update formatting and styles
</commit_message>
<xml_diff>
--- a/(CSE5952adw)MIDTERM PROJECT.docx
+++ b/(CSE5952adw)MIDTERM PROJECT.docx
@@ -70,20 +70,7 @@
           <w:lang w:val="ru-RU" w:eastAsia="ru-RU"/>
           <w14:ligatures w14:val="none"/>
         </w:rPr>
-        <w:t>.</w:t>
-      </w:r>
-      <w:r>
-        <w:rPr>
-          <w:rFonts w:ascii="Times New Roman" w:eastAsia="Times New Roman" w:hAnsi="Times New Roman" w:cs="Times New Roman"/>
-          <w:b/>
-          <w:bCs/>
-          <w:kern w:val="0"/>
-          <w:sz w:val="28"/>
-          <w:szCs w:val="28"/>
-          <w:lang w:val="ru-RU" w:eastAsia="ru-RU"/>
-          <w14:ligatures w14:val="none"/>
-        </w:rPr>
-        <w:t>.</w:t>
+        <w:t>…</w:t>
       </w:r>
     </w:p>
     <w:p>

</xml_diff>

<commit_message>
final version of documentation
</commit_message>
<xml_diff>
--- a/(CSE5952adw)MIDTERM PROJECT.docx
+++ b/(CSE5952adw)MIDTERM PROJECT.docx
@@ -71,6 +71,19 @@
           <w14:ligatures w14:val="none"/>
         </w:rPr>
         <w:t>…</w:t>
+      </w:r>
+      <w:r>
+        <w:rPr>
+          <w:rFonts w:ascii="Times New Roman" w:eastAsia="Times New Roman" w:hAnsi="Times New Roman" w:cs="Times New Roman"/>
+          <w:b/>
+          <w:bCs/>
+          <w:kern w:val="0"/>
+          <w:sz w:val="28"/>
+          <w:szCs w:val="28"/>
+          <w:lang w:val="ru-RU" w:eastAsia="ru-RU"/>
+          <w14:ligatures w14:val="none"/>
+        </w:rPr>
+        <w:t>.</w:t>
       </w:r>
     </w:p>
     <w:p>

</xml_diff>